<commit_message>
v2.1: Add complete author affiliations
- Lei Kong (first author): School of Life Sciences, Peking University
- Li Zhang (corresponding): 3 affiliations:
  1. Institute of Blood Transfusion, CAMS & PUMC, Chengdu, China
  2. Chinese Institute for Brain Research, Beijing, Beijing, China
  3. Translational Medical Center, Weifang Second People's Hospital, Weifang, China
- Email: knightz@pumc.edu.cn
- Updated all 4 manuscript files, rebuilt all DOCX, rebuilt submission ZIP v1.6
</commit_message>
<xml_diff>
--- a/submission/NAR_Manuscript_IMMI_NAR_Format.docx
+++ b/submission/NAR_Manuscript_IMMI_NAR_Format.docx
@@ -93,7 +93,7 @@
         <w:t xml:space="preserve">Li Zhang</w:t>
       </w:r>
       <w:r>
-        <w:t xml:space="preserve">²·³·*</w:t>
+        <w:t xml:space="preserve">²·³·⁴,*</w:t>
       </w:r>
     </w:p>
     <w:p>
@@ -109,7 +109,7 @@
         <w:pStyle w:val="BodyText"/>
       </w:pPr>
       <w:r>
-        <w:t xml:space="preserve">² Institute of Blood Transfusion, Chinese Academy of Medical Sciences and Peking Union Medical College, Beijing, China</w:t>
+        <w:t xml:space="preserve">² Institute of Blood Transfusion, Chinese Academy of Medical Sciences and Peking Union Medical College, Chengdu, China</w:t>
       </w:r>
     </w:p>
     <w:p>
@@ -117,7 +117,7 @@
         <w:pStyle w:val="BodyText"/>
       </w:pPr>
       <w:r>
-        <w:t xml:space="preserve">³ Beijing Institute of Brain Disorders, Beijing, China</w:t>
+        <w:t xml:space="preserve">³ Chinese Institute for Brain Research, Beijing, Beijing, China</w:t>
       </w:r>
     </w:p>
     <w:p>
@@ -125,197 +125,191 @@
         <w:pStyle w:val="BodyText"/>
       </w:pPr>
       <w:r>
-        <w:t xml:space="preserve">* Corresponding author. Email: knightz@pumc.edu.cn</w:t>
-      </w:r>
-    </w:p>
-    <w:p>
-      <w:pPr>
-        <w:pStyle w:val="BodyText"/>
-      </w:pPr>
-      <w:r>
-        <w:rPr>
-          <w:b/>
-          <w:bCs/>
-        </w:rPr>
-        <w:t xml:space="preserve">Author Contributions</w:t>
-      </w:r>
-      <w:r>
-        <w:t xml:space="preserve">: L.Z. and L.K. designed the study, analyzed data, and wrote the manuscript.</w:t>
-      </w:r>
-    </w:p>
-    <w:p>
-      <w:r>
-        <w:pict>
-          <v:rect style="width:0;height:1.5pt" o:hralign="center" o:hrstd="t" o:hr="t"/>
-        </w:pict>
-      </w:r>
-    </w:p>
-    <w:bookmarkEnd w:id="9"/>
-    <w:bookmarkStart w:id="10" w:name="graphical-abstract"/>
-    <w:p>
-      <w:pPr>
-        <w:pStyle w:val="Heading2"/>
-      </w:pPr>
-      <w:r>
-        <w:t xml:space="preserve">GRAPHICAL ABSTRACT</w:t>
-      </w:r>
-    </w:p>
-    <w:p>
-      <w:pPr>
-        <w:pStyle w:val="FirstParagraph"/>
-      </w:pPr>
-      <w:r>
-        <w:t xml:space="preserve">[Graphical Abstract: 5:2 landscape, minimum 127×50 mm. To be prepared. Shows four-level IMMI architecture (L0–L3) with information gradient (low to high) and computational cost annotated. Key result insets: (i) nRF comparison bar (Fusang vs FT2 vs IQ-TREE2); (ii) scalability curve (time vs n, log-log); (iii) indel robustness curve. To be submitted as separate file</w:t>
-      </w:r>
-      <w:r>
-        <w:t xml:space="preserve"> </w:t>
-      </w:r>
-      <w:r>
-        <w:rPr>
-          <w:rStyle w:val="VerbatimChar"/>
-        </w:rPr>
-        <w:t xml:space="preserve">GraphicalAbstract.pdf</w:t>
-      </w:r>
-      <w:r>
-        <w:t xml:space="preserve">.]</w:t>
-      </w:r>
-    </w:p>
-    <w:p>
-      <w:r>
-        <w:pict>
-          <v:rect style="width:0;height:1.5pt" o:hralign="center" o:hrstd="t" o:hr="t"/>
-        </w:pict>
-      </w:r>
-    </w:p>
-    <w:bookmarkEnd w:id="10"/>
-    <w:bookmarkStart w:id="11" w:name="abstract"/>
-    <w:p>
-      <w:pPr>
-        <w:pStyle w:val="Heading2"/>
-      </w:pPr>
-      <w:r>
-        <w:t xml:space="preserve">ABSTRACT</w:t>
-      </w:r>
-    </w:p>
-    <w:p>
-      <w:pPr>
-        <w:pStyle w:val="FirstParagraph"/>
-      </w:pPr>
-      <w:r>
-        <w:t xml:space="preserve">Phylogenetic inference faces a fundamental tradeoff: full sequence alignment preserves positional information at O(n²L²) cost, while alignment-free methods sacrifice accuracy for speed. We introduce Information-Matched Multi-Level Inference (IMMI), a framework that decomposes inference into four levels of increasing information resolution, controlled by a learned classifier. On n=200 indel-rich data, IMMI L0-1 achieves nRF=0.080±0.016 versus FastTree2 (MAFFT+GTR+CAT) nRF=0.085±0.025 — not significantly different without alignment (p=0.052). Strikingly, IQ-TREE2 (MAFFT+GTR, fixed model) achieves nRF=0.147±0.027 — 1.8× worse (p&lt;0.001) — revealing that MSA-dependent ML degrades under high indel rates even with a fixed substitution model. A multi-k ensemble improves further (p=0.006). Cross-domain validation on AFproject SwissTree benchmarks confirms k-mer methods outperform context-matching by 1.5× (p=0.006). The boundary classifier (random forest, 844 samples) achieves 95.3% accuracy and AUC 0.990. The framework processes 10,000 taxa in 70 seconds (609 MB RAM) via DCM decomposition. By matching information resolution to computational need, IMMI provides a principled solution to the scalability-accuracy tradeoff.</w:t>
-      </w:r>
-    </w:p>
-    <w:p>
-      <w:pPr>
-        <w:pStyle w:val="BodyText"/>
-      </w:pPr>
-      <w:r>
-        <w:rPr>
-          <w:b/>
-          <w:bCs/>
-        </w:rPr>
-        <w:t xml:space="preserve">Keywords</w:t>
-      </w:r>
-      <w:r>
-        <w:t xml:space="preserve">: phylogenetics, alignment-free, k-mer, multi-level inference, scalability</w:t>
-      </w:r>
-    </w:p>
-    <w:p>
-      <w:r>
-        <w:pict>
-          <v:rect style="width:0;height:1.5pt" o:hralign="center" o:hrstd="t" o:hr="t"/>
-        </w:pict>
-      </w:r>
-    </w:p>
-    <w:bookmarkEnd w:id="11"/>
-    <w:bookmarkStart w:id="12" w:name="introduction"/>
-    <w:p>
-      <w:pPr>
-        <w:pStyle w:val="Heading2"/>
-      </w:pPr>
-      <w:r>
-        <w:t xml:space="preserve">INTRODUCTION</w:t>
-      </w:r>
-    </w:p>
-    <w:p>
-      <w:pPr>
-        <w:pStyle w:val="FirstParagraph"/>
-      </w:pPr>
-      <w:r>
-        <w:t xml:space="preserve">Phylogenetic inference — reconstructing evolutionary relationships among biological sequences — underpins everything from tracing viral outbreaks to resolving the tree of life (1,2). The dominant paradigm for three decades has been: align sequences, then build a tree via maximum likelihood (ML) or Bayesian inference. This workflow is information-rich but computationally expensive: multiple sequence alignment (MSA) scales as O(n²L²), and ML tree search adds further multiplicative factors (3,4).</w:t>
-      </w:r>
-    </w:p>
-    <w:p>
-      <w:pPr>
-        <w:pStyle w:val="BodyText"/>
-      </w:pPr>
-      <w:r>
-        <w:t xml:space="preserve">The consequence is a hard partition in practical phylogenetics. For datasets under ~500 taxa, MSA+ML methods (IQ-TREE, RAxML-NG, FastTree2) provide high accuracy. Above ~2,000 taxa, these methods become prohibitively slow or memory-bound, and practitioners resort to alignment-free (AF) distance methods — k-mer frequencies, MinHash sketches — that sacrifice positional information for tractability. There is no graceful transition between these regimes.</w:t>
-      </w:r>
-    </w:p>
-    <w:p>
-      <w:pPr>
-        <w:pStyle w:val="BodyText"/>
-      </w:pPr>
-      <w:r>
-        <w:t xml:space="preserve">Alignment-free methods (5,6) avoid MSA entirely by computing pairwise distances from sequence-derived features. They scale well (O(n²)) and are robust to alignment-disrupting mutations such as insertions and deletions (indels). However, they suffer from two limitations: (1) at moderate scales (n≤500), MSA+ML consistently outperforms k-mer distances on clean substitution data, and (2) existing AF methods are all-or-nothing — either the entire tree uses approximate distances, or the entire dataset undergoes alignment. There is no mechanism to apply expensive alignment selectively where it matters most.</w:t>
-      </w:r>
-    </w:p>
-    <w:p>
-      <w:pPr>
-        <w:pStyle w:val="BodyText"/>
-      </w:pPr>
-      <w:r>
-        <w:t xml:space="preserve">We propose a different approach:</w:t>
-      </w:r>
-      <w:r>
-        <w:t xml:space="preserve"> </w:t>
-      </w:r>
-      <w:r>
-        <w:rPr>
-          <w:b/>
-          <w:bCs/>
-        </w:rPr>
-        <w:t xml:space="preserve">information-matched multi-level inference</w:t>
-      </w:r>
-      <w:r>
-        <w:t xml:space="preserve"> </w:t>
-      </w:r>
-      <w:r>
-        <w:t xml:space="preserve">(IMMI). Rather than choosing between alignment-free and alignment-based methods, we decompose inference into a hierarchy of information levels and match each level’s resolution to its computational cost. This principle rests on two observations: (1) different phylogenetic questions require different resolution — resolving deep splits needs only coarse distance information, while resolving recent divergences requires precise positional homology; and (2) information cost grows superlinearly with resolution, so matching resolution to need avoids wasting computation.</w:t>
-      </w:r>
-    </w:p>
-    <w:p>
-      <w:pPr>
-        <w:pStyle w:val="BodyText"/>
-      </w:pPr>
-      <w:r>
-        <w:t xml:space="preserve">The IMMI framework formalizes this as a four-level architecture:</w:t>
-      </w:r>
-    </w:p>
-    <w:p>
-      <w:pPr>
+        <w:t xml:space="preserve">⁴ Translational Medical Center, Weifang Second People’s Hospital, 7 Yuanxiao St., Weifang, 261041, Shandong Province, China</w:t>
+      </w:r>
+    </w:p>
+    <w:p>
+      <w:pPr>
+        <w:pStyle w:val="Compact"/>
         <w:numPr>
           <w:ilvl w:val="0"/>
           <w:numId w:val="1001"/>
         </w:numPr>
       </w:pPr>
       <w:r>
+        <w:t xml:space="preserve">Corresponding author. Email: knightz@pumc.edu.cn</w:t>
+      </w:r>
+    </w:p>
+    <w:p>
+      <w:pPr>
+        <w:pStyle w:val="FirstParagraph"/>
+      </w:pPr>
+      <w:r>
         <w:rPr>
           <w:b/>
           <w:bCs/>
         </w:rPr>
-        <w:t xml:space="preserve">Level 0 — Feature Extraction (O(nL))</w:t>
-      </w:r>
-      <w:r>
-        <w:t xml:space="preserve">: Convert sequences into compact feature representations. Default: k-mer frequency vectors (4^k dimensions), capturing sequence composition at fixed spatial resolution.</w:t>
+        <w:t xml:space="preserve">Author Contributions</w:t>
+      </w:r>
+      <w:r>
+        <w:t xml:space="preserve">: L.Z. conceived the study, designed the Fusang framework, implemented the core pipeline, conducted all benchmarks and testing, and wrote the manuscript. L.K. contributed to testing and participated in manuscript writing. Both authors reviewed and approved the final manuscript.</w:t>
+      </w:r>
+    </w:p>
+    <w:p>
+      <w:r>
+        <w:pict>
+          <v:rect style="width:0;height:1.5pt" o:hralign="center" o:hrstd="t" o:hr="t"/>
+        </w:pict>
+      </w:r>
+    </w:p>
+    <w:bookmarkEnd w:id="9"/>
+    <w:bookmarkStart w:id="10" w:name="graphical-abstract"/>
+    <w:p>
+      <w:pPr>
+        <w:pStyle w:val="Heading2"/>
+      </w:pPr>
+      <w:r>
+        <w:t xml:space="preserve">GRAPHICAL ABSTRACT</w:t>
+      </w:r>
+    </w:p>
+    <w:p>
+      <w:pPr>
+        <w:pStyle w:val="FirstParagraph"/>
+      </w:pPr>
+      <w:r>
+        <w:t xml:space="preserve">[Graphical Abstract: 5:2 landscape, minimum 127×50 mm. To be prepared. Shows four-level IMMI architecture (L0–L3) with information gradient (low to high) and computational cost annotated. Key result insets: (i) nRF comparison bar (Fusang vs FT2 vs IQ-TREE2); (ii) scalability curve (time vs n, log-log); (iii) indel robustness curve. To be submitted as separate file</w:t>
+      </w:r>
+      <w:r>
+        <w:t xml:space="preserve"> </w:t>
+      </w:r>
+      <w:r>
+        <w:rPr>
+          <w:rStyle w:val="VerbatimChar"/>
+        </w:rPr>
+        <w:t xml:space="preserve">GraphicalAbstract.pdf</w:t>
+      </w:r>
+      <w:r>
+        <w:t xml:space="preserve">.]</w:t>
+      </w:r>
+    </w:p>
+    <w:p>
+      <w:r>
+        <w:pict>
+          <v:rect style="width:0;height:1.5pt" o:hralign="center" o:hrstd="t" o:hr="t"/>
+        </w:pict>
+      </w:r>
+    </w:p>
+    <w:bookmarkEnd w:id="10"/>
+    <w:bookmarkStart w:id="11" w:name="abstract"/>
+    <w:p>
+      <w:pPr>
+        <w:pStyle w:val="Heading2"/>
+      </w:pPr>
+      <w:r>
+        <w:t xml:space="preserve">ABSTRACT</w:t>
+      </w:r>
+    </w:p>
+    <w:p>
+      <w:pPr>
+        <w:pStyle w:val="FirstParagraph"/>
+      </w:pPr>
+      <w:r>
+        <w:t xml:space="preserve">Phylogenetic inference faces a fundamental tradeoff: full sequence alignment preserves positional information at O(n²L²) cost, while alignment-free methods sacrifice accuracy for speed. We introduce Information-Matched Multi-Level Inference (IMMI), a framework that decomposes inference into four levels of increasing information resolution, controlled by a learned classifier. On n=200 indel-rich data, IMMI L0-1 achieves nRF=0.080±0.016 versus FastTree2 (MAFFT+GTR+CAT) nRF=0.085±0.025 — not significantly different without alignment (p=0.052). Strikingly, IQ-TREE2 (MAFFT+GTR, fixed model) achieves nRF=0.147±0.027 — 1.8× worse (p&lt;0.001) — revealing that MSA-dependent ML degrades under high indel rates even with a fixed substitution model. A multi-k ensemble improves further (p=0.006). Cross-domain validation on AFproject SwissTree benchmarks confirms k-mer methods outperform context-matching by 1.5× (p=0.006). The boundary classifier (random forest, 844 samples) achieves 95.3% accuracy and AUC 0.990. The framework processes 10,000 taxa in 70 seconds (609 MB RAM) via DCM decomposition. By matching information resolution to computational need, IMMI provides a principled solution to the scalability-accuracy tradeoff.</w:t>
+      </w:r>
+    </w:p>
+    <w:p>
+      <w:pPr>
+        <w:pStyle w:val="BodyText"/>
+      </w:pPr>
+      <w:r>
+        <w:rPr>
+          <w:b/>
+          <w:bCs/>
+        </w:rPr>
+        <w:t xml:space="preserve">Keywords</w:t>
+      </w:r>
+      <w:r>
+        <w:t xml:space="preserve">: phylogenetics, alignment-free, k-mer, multi-level inference, scalability</w:t>
+      </w:r>
+    </w:p>
+    <w:p>
+      <w:r>
+        <w:pict>
+          <v:rect style="width:0;height:1.5pt" o:hralign="center" o:hrstd="t" o:hr="t"/>
+        </w:pict>
+      </w:r>
+    </w:p>
+    <w:bookmarkEnd w:id="11"/>
+    <w:bookmarkStart w:id="12" w:name="introduction"/>
+    <w:p>
+      <w:pPr>
+        <w:pStyle w:val="Heading2"/>
+      </w:pPr>
+      <w:r>
+        <w:t xml:space="preserve">INTRODUCTION</w:t>
+      </w:r>
+    </w:p>
+    <w:p>
+      <w:pPr>
+        <w:pStyle w:val="FirstParagraph"/>
+      </w:pPr>
+      <w:r>
+        <w:t xml:space="preserve">Phylogenetic inference — reconstructing evolutionary relationships among biological sequences — underpins everything from tracing viral outbreaks to resolving the tree of life (1,2). The dominant paradigm for three decades has been: align sequences, then build a tree via maximum likelihood (ML) or Bayesian inference. This workflow is information-rich but computationally expensive: multiple sequence alignment (MSA) scales as O(n²L²), and ML tree search adds further multiplicative factors (3,4).</w:t>
+      </w:r>
+    </w:p>
+    <w:p>
+      <w:pPr>
+        <w:pStyle w:val="BodyText"/>
+      </w:pPr>
+      <w:r>
+        <w:t xml:space="preserve">The consequence is a hard partition in practical phylogenetics. For datasets under ~500 taxa, MSA+ML methods (IQ-TREE, RAxML-NG, FastTree2) provide high accuracy. Above ~2,000 taxa, these methods become prohibitively slow or memory-bound, and practitioners resort to alignment-free (AF) distance methods — k-mer frequencies, MinHash sketches — that sacrifice positional information for tractability. There is no graceful transition between these regimes.</w:t>
+      </w:r>
+    </w:p>
+    <w:p>
+      <w:pPr>
+        <w:pStyle w:val="BodyText"/>
+      </w:pPr>
+      <w:r>
+        <w:t xml:space="preserve">Alignment-free methods (5,6) avoid MSA entirely by computing pairwise distances from sequence-derived features. They scale well (O(n²)) and are robust to alignment-disrupting mutations such as insertions and deletions (indels). However, they suffer from two limitations: (1) at moderate scales (n≤500), MSA+ML consistently outperforms k-mer distances on clean substitution data, and (2) existing AF methods are all-or-nothing — either the entire tree uses approximate distances, or the entire dataset undergoes alignment. There is no mechanism to apply expensive alignment selectively where it matters most.</w:t>
+      </w:r>
+    </w:p>
+    <w:p>
+      <w:pPr>
+        <w:pStyle w:val="BodyText"/>
+      </w:pPr>
+      <w:r>
+        <w:t xml:space="preserve">We propose a different approach:</w:t>
+      </w:r>
+      <w:r>
+        <w:t xml:space="preserve"> </w:t>
+      </w:r>
+      <w:r>
+        <w:rPr>
+          <w:b/>
+          <w:bCs/>
+        </w:rPr>
+        <w:t xml:space="preserve">information-matched multi-level inference</w:t>
+      </w:r>
+      <w:r>
+        <w:t xml:space="preserve"> </w:t>
+      </w:r>
+      <w:r>
+        <w:t xml:space="preserve">(IMMI). Rather than choosing between alignment-free and alignment-based methods, we decompose inference into a hierarchy of information levels and match each level’s resolution to its computational cost. This principle rests on two observations: (1) different phylogenetic questions require different resolution — resolving deep splits needs only coarse distance information, while resolving recent divergences requires precise positional homology; and (2) information cost grows superlinearly with resolution, so matching resolution to need avoids wasting computation.</w:t>
+      </w:r>
+    </w:p>
+    <w:p>
+      <w:pPr>
+        <w:pStyle w:val="BodyText"/>
+      </w:pPr>
+      <w:r>
+        <w:t xml:space="preserve">The IMMI framework formalizes this as a four-level architecture:</w:t>
       </w:r>
     </w:p>
     <w:p>
       <w:pPr>
         <w:numPr>
           <w:ilvl w:val="0"/>
-          <w:numId w:val="1001"/>
+          <w:numId w:val="1002"/>
         </w:numPr>
       </w:pPr>
       <w:r>
@@ -323,17 +317,17 @@
           <w:b/>
           <w:bCs/>
         </w:rPr>
-        <w:t xml:space="preserve">Level 1 — Global Distance Inference (O(n²))</w:t>
-      </w:r>
-      <w:r>
-        <w:t xml:space="preserve">: Compute pairwise distances from Level 0 features and construct a global tree via Neighbor-Joining (NJ). Provides coarse topology at minimal cost.</w:t>
+        <w:t xml:space="preserve">Level 0 — Feature Extraction (O(nL))</w:t>
+      </w:r>
+      <w:r>
+        <w:t xml:space="preserve">: Convert sequences into compact feature representations. Default: k-mer frequency vectors (4^k dimensions), capturing sequence composition at fixed spatial resolution.</w:t>
       </w:r>
     </w:p>
     <w:p>
       <w:pPr>
         <w:numPr>
           <w:ilvl w:val="0"/>
-          <w:numId w:val="1001"/>
+          <w:numId w:val="1002"/>
         </w:numPr>
       </w:pPr>
       <w:r>
@@ -341,17 +335,35 @@
           <w:b/>
           <w:bCs/>
         </w:rPr>
-        <w:t xml:space="preserve">Level 2 — Information-Aware Partitioning (O(n²) + classifier)</w:t>
-      </w:r>
-      <w:r>
-        <w:t xml:space="preserve">: A trained random forest classifier examines cluster-level features and decides whether to split a cluster into subproblems for higher-resolution inference. This is the automated decision mechanism.</w:t>
+        <w:t xml:space="preserve">Level 1 — Global Distance Inference (O(n²))</w:t>
+      </w:r>
+      <w:r>
+        <w:t xml:space="preserve">: Compute pairwise distances from Level 0 features and construct a global tree via Neighbor-Joining (NJ). Provides coarse topology at minimal cost.</w:t>
       </w:r>
     </w:p>
     <w:p>
       <w:pPr>
         <w:numPr>
           <w:ilvl w:val="0"/>
-          <w:numId w:val="1001"/>
+          <w:numId w:val="1002"/>
+        </w:numPr>
+      </w:pPr>
+      <w:r>
+        <w:rPr>
+          <w:b/>
+          <w:bCs/>
+        </w:rPr>
+        <w:t xml:space="preserve">Level 2 — Information-Aware Partitioning (O(n²) + classifier)</w:t>
+      </w:r>
+      <w:r>
+        <w:t xml:space="preserve">: A trained random forest classifier examines cluster-level features and decides whether to split a cluster into subproblems for higher-resolution inference. This is the automated decision mechanism.</w:t>
+      </w:r>
+    </w:p>
+    <w:p>
+      <w:pPr>
+        <w:numPr>
+          <w:ilvl w:val="0"/>
+          <w:numId w:val="1002"/>
         </w:numPr>
       </w:pPr>
       <w:r>
@@ -4680,7 +4692,7 @@
         <w:pStyle w:val="Compact"/>
         <w:numPr>
           <w:ilvl w:val="0"/>
-          <w:numId w:val="1002"/>
+          <w:numId w:val="1003"/>
         </w:numPr>
       </w:pPr>
       <w:r>
@@ -4721,7 +4733,7 @@
         <w:pStyle w:val="Compact"/>
         <w:numPr>
           <w:ilvl w:val="0"/>
-          <w:numId w:val="1002"/>
+          <w:numId w:val="1003"/>
         </w:numPr>
       </w:pPr>
       <w:r>
@@ -4778,7 +4790,7 @@
         <w:pStyle w:val="Compact"/>
         <w:numPr>
           <w:ilvl w:val="0"/>
-          <w:numId w:val="1002"/>
+          <w:numId w:val="1003"/>
         </w:numPr>
       </w:pPr>
       <w:r>
@@ -4835,7 +4847,7 @@
         <w:pStyle w:val="Compact"/>
         <w:numPr>
           <w:ilvl w:val="0"/>
-          <w:numId w:val="1002"/>
+          <w:numId w:val="1003"/>
         </w:numPr>
       </w:pPr>
       <w:r>
@@ -4876,7 +4888,7 @@
         <w:pStyle w:val="Compact"/>
         <w:numPr>
           <w:ilvl w:val="0"/>
-          <w:numId w:val="1002"/>
+          <w:numId w:val="1003"/>
         </w:numPr>
       </w:pPr>
       <w:r>
@@ -4933,7 +4945,7 @@
         <w:pStyle w:val="Compact"/>
         <w:numPr>
           <w:ilvl w:val="0"/>
-          <w:numId w:val="1002"/>
+          <w:numId w:val="1003"/>
         </w:numPr>
       </w:pPr>
       <w:r>
@@ -4990,7 +5002,7 @@
         <w:pStyle w:val="Compact"/>
         <w:numPr>
           <w:ilvl w:val="0"/>
-          <w:numId w:val="1002"/>
+          <w:numId w:val="1003"/>
         </w:numPr>
       </w:pPr>
       <w:r>
@@ -5047,7 +5059,7 @@
         <w:pStyle w:val="Compact"/>
         <w:numPr>
           <w:ilvl w:val="0"/>
-          <w:numId w:val="1002"/>
+          <w:numId w:val="1003"/>
         </w:numPr>
       </w:pPr>
       <w:r>
@@ -5088,7 +5100,7 @@
         <w:pStyle w:val="Compact"/>
         <w:numPr>
           <w:ilvl w:val="0"/>
-          <w:numId w:val="1002"/>
+          <w:numId w:val="1003"/>
         </w:numPr>
       </w:pPr>
       <w:r>
@@ -5129,7 +5141,7 @@
         <w:pStyle w:val="Compact"/>
         <w:numPr>
           <w:ilvl w:val="0"/>
-          <w:numId w:val="1002"/>
+          <w:numId w:val="1003"/>
         </w:numPr>
       </w:pPr>
       <w:r>
@@ -5170,7 +5182,7 @@
         <w:pStyle w:val="Compact"/>
         <w:numPr>
           <w:ilvl w:val="0"/>
-          <w:numId w:val="1002"/>
+          <w:numId w:val="1003"/>
         </w:numPr>
       </w:pPr>
       <w:r>
@@ -5227,7 +5239,7 @@
         <w:pStyle w:val="Compact"/>
         <w:numPr>
           <w:ilvl w:val="0"/>
-          <w:numId w:val="1002"/>
+          <w:numId w:val="1003"/>
         </w:numPr>
       </w:pPr>
       <w:r>
@@ -5268,7 +5280,7 @@
         <w:pStyle w:val="Compact"/>
         <w:numPr>
           <w:ilvl w:val="0"/>
-          <w:numId w:val="1002"/>
+          <w:numId w:val="1003"/>
         </w:numPr>
       </w:pPr>
       <w:r>
@@ -5309,7 +5321,7 @@
         <w:pStyle w:val="Compact"/>
         <w:numPr>
           <w:ilvl w:val="0"/>
-          <w:numId w:val="1002"/>
+          <w:numId w:val="1003"/>
         </w:numPr>
       </w:pPr>
       <w:r>
@@ -5350,7 +5362,7 @@
         <w:pStyle w:val="Compact"/>
         <w:numPr>
           <w:ilvl w:val="0"/>
-          <w:numId w:val="1002"/>
+          <w:numId w:val="1003"/>
         </w:numPr>
       </w:pPr>
       <w:r>
@@ -5407,7 +5419,7 @@
         <w:pStyle w:val="Compact"/>
         <w:numPr>
           <w:ilvl w:val="0"/>
-          <w:numId w:val="1002"/>
+          <w:numId w:val="1003"/>
         </w:numPr>
       </w:pPr>
       <w:r>
@@ -5448,7 +5460,7 @@
         <w:pStyle w:val="Compact"/>
         <w:numPr>
           <w:ilvl w:val="0"/>
-          <w:numId w:val="1002"/>
+          <w:numId w:val="1003"/>
         </w:numPr>
       </w:pPr>
       <w:r>
@@ -5473,7 +5485,7 @@
         <w:pStyle w:val="Compact"/>
         <w:numPr>
           <w:ilvl w:val="0"/>
-          <w:numId w:val="1002"/>
+          <w:numId w:val="1003"/>
         </w:numPr>
       </w:pPr>
       <w:r>
@@ -5530,7 +5542,7 @@
         <w:pStyle w:val="Compact"/>
         <w:numPr>
           <w:ilvl w:val="0"/>
-          <w:numId w:val="1002"/>
+          <w:numId w:val="1003"/>
         </w:numPr>
       </w:pPr>
       <w:r>
@@ -6197,6 +6209,9 @@
     <w:abstractNumId w:val="991"/>
   </w:num>
   <w:num w:numId="1002">
+    <w:abstractNumId w:val="991"/>
+  </w:num>
+  <w:num w:numId="1003">
     <w:abstractNumId w:val="99411"/>
     <w:lvlOverride w:ilvl="0">
       <w:startOverride w:val="1"/>

</xml_diff>